<commit_message>
Remove obsolete desktop packaging documentation
</commit_message>
<xml_diff>
--- a/docs/13출시·마케팅/HELL_DIROI_종합확장전략기획서_v2_0.docx
+++ b/docs/13출시·마케팅/HELL_DIROI_종합확장전략기획서_v2_0.docx
@@ -514,7 +514,7 @@
                 <w:sz w:val="22"/>
                 <w:szCs w:val="22"/>
               </w:rPr>
-              <w:t xml:space="preserve">4. 두 게임 모두 NW.js 통일 (Electron 폐기). 빌드 도구 단일화.</w:t>
+              <w:t xml:space="preserve">4. 두 게임 모두 NW.js 통일. 빌드 도구 단일화.</w:t>
             </w:r>
           </w:p>
           <w:p>
@@ -9475,7 +9475,7 @@
           <w:sz w:val="22"/>
           <w:szCs w:val="22"/>
         </w:rPr>
-        <w:t xml:space="preserve">HELL과 DIROI 모두 NW.js로 통일. Electron 빌드는 보관 후 폐기.</w:t>
+        <w:t xml:space="preserve">HELL과 DIROI 모두 NW.js로 통일.</w:t>
       </w:r>
     </w:p>
     <w:tbl>
@@ -9782,7 +9782,7 @@
                 <w:sz w:val="22"/>
                 <w:szCs w:val="22"/>
               </w:rPr>
-              <w:t xml:space="preserve">G:\hell\Electron\ (폐기)</w:t>
+              <w:t xml:space="preserve">G:\exoduser\out\EXODUSER-win64\</w:t>
             </w:r>
           </w:p>
         </w:tc>
@@ -9809,7 +9809,7 @@
                 <w:sz w:val="22"/>
                 <w:szCs w:val="22"/>
               </w:rPr>
-              <w:t xml:space="preserve">NW.js 신규 구축</w:t>
+              <w:t xml:space="preserve">NW.js 0.111.2 / Windows x64</w:t>
             </w:r>
           </w:p>
         </w:tc>
@@ -24944,7 +24944,7 @@
           <w:sz w:val="22"/>
           <w:szCs w:val="22"/>
         </w:rPr>
-        <w:t xml:space="preserve">Electron 폴더 보관 (NW.js 이주 실패 시 rollback)</w:t>
+        <w:t xml:space="preserve">NW.js 패키지 갱신 전 기존 출력물 백업</w:t>
       </w:r>
     </w:p>
     <w:p>
@@ -28299,7 +28299,7 @@
                 <w:sz w:val="22"/>
                 <w:szCs w:val="22"/>
               </w:rPr>
-              <w:t xml:space="preserve">TBD (신규 구축 예정)</w:t>
+              <w:t xml:space="preserve">G:\exoduser\out\EXODUSER-win64\</w:t>
             </w:r>
           </w:p>
         </w:tc>
@@ -28326,7 +28326,7 @@
                 <w:sz w:val="22"/>
                 <w:szCs w:val="22"/>
               </w:rPr>
-              <w:t xml:space="preserve">계획</w:t>
+              <w:t xml:space="preserve">구현</w:t>
             </w:r>
           </w:p>
         </w:tc>
@@ -28382,7 +28382,7 @@
                 <w:sz w:val="22"/>
                 <w:szCs w:val="22"/>
               </w:rPr>
-              <w:t xml:space="preserve">HELL Electron (구)</w:t>
+              <w:t xml:space="preserve">NW.js 빌드 설정</w:t>
             </w:r>
           </w:p>
         </w:tc>
@@ -28409,7 +28409,7 @@
                 <w:sz w:val="22"/>
                 <w:szCs w:val="22"/>
               </w:rPr>
-              <w:t xml:space="preserve">G:\hell\Electron\</w:t>
+              <w:t xml:space="preserve">G:\exoduser\build-nwjs.mjs</w:t>
             </w:r>
           </w:p>
         </w:tc>
@@ -28436,7 +28436,7 @@
                 <w:sz w:val="22"/>
                 <w:szCs w:val="22"/>
               </w:rPr>
-              <w:t xml:space="preserve">폐기 예정</w:t>
+              <w:t xml:space="preserve">사용 중</w:t>
             </w:r>
           </w:p>
         </w:tc>
@@ -28463,7 +28463,7 @@
                 <w:sz w:val="22"/>
                 <w:szCs w:val="22"/>
               </w:rPr>
-              <w:t xml:space="preserve">백업 후 보관</w:t>
+              <w:t xml:space="preserve">Windows x64 패키징</w:t>
             </w:r>
           </w:p>
         </w:tc>
@@ -28820,7 +28820,7 @@
           <w:sz w:val="22"/>
           <w:szCs w:val="22"/>
         </w:rPr>
-        <w:t xml:space="preserve">HELL Electron 폴더 백업 (G:\hell\Electron-archived-20260515\)</w:t>
+        <w:t xml:space="preserve">HELL NW.js 패키지 갱신 전 기존 출력물 백업</w:t>
       </w:r>
     </w:p>
     <w:p>

</xml_diff>